<commit_message>
context: update conversation context 2026-09-14
</commit_message>
<xml_diff>
--- a/projects/qube-agency/qube-capabilities-brief.docx
+++ b/projects/qube-agency/qube-capabilities-brief.docx
@@ -570,7 +570,7 @@
                 <w:color w:val="232832"/>
                 <w:sz w:val="19"/>
               </w:rPr>
-              <w:t>Tier 3 + phase decomposition (reach/grasp/manipulate/release boundaries) + teleoperation demonstrations where specified.</w:t>
+              <w:t>Tier 3 + phase decomposition -- reach, grasp, manipulate, and release boundaries labeled for every action segment.</w:t>
             </w:r>
           </w:p>
         </w:tc>
@@ -635,7 +635,7 @@
                 <w:color w:val="232832"/>
                 <w:sz w:val="19"/>
               </w:rPr>
-              <w:t>Tier 4 + gaze data -- fixation and saccade coordinates per frame via Tobii hardware, or post-hoc estimation (flagged with confidence score).</w:t>
+              <w:t>Tier 4 + post-hoc gaze estimation -- fixation regions estimated from head pose (OpenFace 2.0) and saliency models (GazeTR). Flagged with method and confidence score. Not hardware-precise gaze.</w:t>
             </w:r>
           </w:p>
         </w:tc>
@@ -656,7 +656,7 @@
                 <w:color w:val="232832"/>
                 <w:sz w:val="19"/>
               </w:rPr>
-              <w:t>Attention modeling, human-robot interaction research, gaze-conditioned policies.</w:t>
+              <w:t>Attention modeling, gaze-informed policy research. Note: estimated regions, not exact coordinates.</w:t>
             </w:r>
           </w:p>
         </w:tc>
@@ -946,7 +946,7 @@
                 <w:color w:val="28508C"/>
                 <w:sz w:val="19"/>
               </w:rPr>
-              <w:t>Gaze</w:t>
+              <w:t>Gaze (post-hoc estimated)</w:t>
             </w:r>
           </w:p>
         </w:tc>
@@ -968,7 +968,7 @@
                 <w:color w:val="232832"/>
                 <w:sz w:val="19"/>
               </w:rPr>
-              <w:t>X/Y pixel coordinates per frame with fixation vs. saccade classification. Hardware gaze: Tobii Pro glasses. Post-hoc estimation: OpenFace 2.0 + GazeTR (flagged with method and confidence score in JSON).</w:t>
+              <w:t>Fixation regions estimated from head pose (OpenFace 2.0) combined with visual saliency models (GazeTR / L2CS-Net). Outputs estimated gaze region per frame, not precise x/y coordinates. All outputs flagged with method: "post_hoc_estimation" and a confidence score in the JSON. Suitable for attention modeling research; not a substitute for hardware gaze.</w:t>
             </w:r>
           </w:p>
         </w:tc>

</xml_diff>